<commit_message>
Update of gene values for test
</commit_message>
<xml_diff>
--- a/EcosystemSimulator Report.docx
+++ b/EcosystemSimulator Report.docx
@@ -35,6 +35,7 @@
           <w:rFonts w:ascii="CMU Serif" w:hAnsi="CMU Serif" w:cs="CMU Serif"/>
           <w:sz w:val="40"/>
           <w:szCs w:val="40"/>
+          <w:u w:val="single"/>
         </w:rPr>
       </w:pPr>
       <w:r>
@@ -42,6 +43,7 @@
           <w:rFonts w:ascii="CMU Serif" w:hAnsi="CMU Serif" w:cs="CMU Serif"/>
           <w:sz w:val="40"/>
           <w:szCs w:val="40"/>
+          <w:u w:val="single"/>
         </w:rPr>
         <w:t>Authors:</w:t>
       </w:r>
@@ -181,6 +183,7 @@
           <w:rFonts w:ascii="CMU Serif" w:hAnsi="CMU Serif" w:cs="CMU Serif"/>
           <w:sz w:val="40"/>
           <w:szCs w:val="40"/>
+          <w:u w:val="single"/>
         </w:rPr>
       </w:pPr>
       <w:r>
@@ -188,6 +191,7 @@
           <w:rFonts w:ascii="CMU Serif" w:hAnsi="CMU Serif" w:cs="CMU Serif"/>
           <w:sz w:val="40"/>
           <w:szCs w:val="40"/>
+          <w:u w:val="single"/>
         </w:rPr>
         <w:t>Introduction:</w:t>
       </w:r>
@@ -212,11 +216,27 @@
     <w:p>
       <w:pPr>
         <w:rPr>
-          <w:rFonts w:ascii="CMU Serif" w:hAnsi="CMU Serif" w:cs="CMU Serif"/>
-          <w:sz w:val="28"/>
-          <w:szCs w:val="28"/>
-        </w:rPr>
-      </w:pPr>
+          <w:rFonts w:ascii="Times New Roman" w:hAnsi="Times New Roman" w:cs="Times New Roman"/>
+          <w:sz w:val="24"/>
+          <w:szCs w:val="24"/>
+        </w:rPr>
+      </w:pPr>
+      <w:r>
+        <w:rPr>
+          <w:rFonts w:ascii="Times New Roman" w:hAnsi="Times New Roman" w:cs="Times New Roman"/>
+          <w:sz w:val="24"/>
+          <w:szCs w:val="24"/>
+        </w:rPr>
+        <w:t xml:space="preserve">Creating an ecosystem where both prey and predators live amongst generations whilst creating mutations for its newer generations, setting the scene for natural selection. This is a simple recreation to achieve a simulation with a balanced population for </w:t>
+      </w:r>
+      <w:r>
+        <w:rPr>
+          <w:rFonts w:ascii="Times New Roman" w:hAnsi="Times New Roman" w:cs="Times New Roman"/>
+          <w:sz w:val="24"/>
+          <w:szCs w:val="24"/>
+        </w:rPr>
+        <w:br/>
+      </w:r>
     </w:p>
     <w:p>
       <w:pPr>
@@ -276,6 +296,7 @@
           <w:rFonts w:ascii="CMU Serif" w:hAnsi="CMU Serif" w:cs="CMU Serif"/>
           <w:sz w:val="40"/>
           <w:szCs w:val="40"/>
+          <w:u w:val="single"/>
         </w:rPr>
       </w:pPr>
       <w:r>
@@ -283,8 +304,9 @@
           <w:rFonts w:ascii="CMU Serif" w:hAnsi="CMU Serif" w:cs="CMU Serif"/>
           <w:sz w:val="40"/>
           <w:szCs w:val="40"/>
-        </w:rPr>
-        <w:t>Simulation Description:</w:t>
+          <w:u w:val="single"/>
+        </w:rPr>
+        <w:t>Simulation Description</w:t>
       </w:r>
     </w:p>
     <w:p>
@@ -303,6 +325,14 @@
         </w:rPr>
         <w:t>Species &amp; Behaviours</w:t>
       </w:r>
+      <w:r>
+        <w:rPr>
+          <w:rFonts w:ascii="CMU Serif" w:hAnsi="CMU Serif" w:cs="CMU Serif"/>
+          <w:sz w:val="32"/>
+          <w:szCs w:val="32"/>
+        </w:rPr>
+        <w:t>:</w:t>
+      </w:r>
     </w:p>
     <w:p>
       <w:pPr>
@@ -328,6 +358,14 @@
           <w:szCs w:val="32"/>
         </w:rPr>
         <w:t>Mechanics</w:t>
+      </w:r>
+      <w:r>
+        <w:rPr>
+          <w:rFonts w:ascii="CMU Serif" w:hAnsi="CMU Serif" w:cs="CMU Serif"/>
+          <w:sz w:val="32"/>
+          <w:szCs w:val="32"/>
+        </w:rPr>
+        <w:t>:</w:t>
       </w:r>
     </w:p>
     <w:p>
@@ -345,6 +383,7 @@
           <w:rFonts w:ascii="CMU Serif" w:hAnsi="CMU Serif" w:cs="CMU Serif"/>
           <w:sz w:val="40"/>
           <w:szCs w:val="40"/>
+          <w:u w:val="single"/>
         </w:rPr>
       </w:pPr>
       <w:r>
@@ -352,7 +391,9 @@
           <w:rFonts w:ascii="CMU Serif" w:hAnsi="CMU Serif" w:cs="CMU Serif"/>
           <w:sz w:val="40"/>
           <w:szCs w:val="40"/>
-        </w:rPr>
+          <w:u w:val="single"/>
+        </w:rPr>
+        <w:lastRenderedPageBreak/>
         <w:t>Extensions and Implementation Details</w:t>
       </w:r>
     </w:p>
@@ -370,7 +411,6 @@
           <w:sz w:val="32"/>
           <w:szCs w:val="32"/>
         </w:rPr>
-        <w:lastRenderedPageBreak/>
         <w:t>Implemented Extensions</w:t>
       </w:r>
     </w:p>

</xml_diff>